<commit_message>
some updation  of files
</commit_message>
<xml_diff>
--- a/Thesis Chapter/Chapater 03 Methodology (1).docx
+++ b/Thesis Chapter/Chapater 03 Methodology (1).docx
@@ -118,7 +118,6 @@
             <w:docPart w:val="DefaultPlaceholder_-1854013440"/>
           </w:placeholder>
         </w:sdtPr>
-        <w:sdtEndPr/>
         <w:sdtContent>
           <w:r>
             <w:rPr>
@@ -147,7 +146,6 @@
             <w:docPart w:val="DefaultPlaceholder_-1854013440"/>
           </w:placeholder>
         </w:sdtPr>
-        <w:sdtEndPr/>
         <w:sdtContent>
           <w:r>
             <w:rPr>
@@ -279,7 +277,6 @@
             <w:docPart w:val="DefaultPlaceholder_-1854013440"/>
           </w:placeholder>
         </w:sdtPr>
-        <w:sdtEndPr/>
         <w:sdtContent>
           <w:r>
             <w:rPr>
@@ -514,7 +511,6 @@
             <w:docPart w:val="DefaultPlaceholder_-1854013440"/>
           </w:placeholder>
         </w:sdtPr>
-        <w:sdtEndPr/>
         <w:sdtContent>
           <w:r>
             <w:rPr>
@@ -596,7 +592,6 @@
             <w:docPart w:val="DefaultPlaceholder_-1854013440"/>
           </w:placeholder>
         </w:sdtPr>
-        <w:sdtEndPr/>
         <w:sdtContent>
           <w:r>
             <w:rPr>
@@ -3350,7 +3345,6 @@
             <w:docPart w:val="DefaultPlaceholder_-1854013440"/>
           </w:placeholder>
         </w:sdtPr>
-        <w:sdtEndPr/>
         <w:sdtContent>
           <w:r>
             <w:rPr>
@@ -3406,7 +3400,6 @@
             <w:docPart w:val="DefaultPlaceholder_-1854013440"/>
           </w:placeholder>
         </w:sdtPr>
-        <w:sdtEndPr/>
         <w:sdtContent>
           <w:r>
             <w:rPr>
@@ -3561,7 +3554,6 @@
             <w:docPart w:val="DefaultPlaceholder_-1854013440"/>
           </w:placeholder>
         </w:sdtPr>
-        <w:sdtEndPr/>
         <w:sdtContent>
           <w:r>
             <w:rPr>
@@ -3867,7 +3859,6 @@
             <w:docPart w:val="DefaultPlaceholder_-1854013440"/>
           </w:placeholder>
         </w:sdtPr>
-        <w:sdtEndPr/>
         <w:sdtContent>
           <w:r>
             <w:rPr>
@@ -4329,7 +4320,6 @@
             <w:docPart w:val="DefaultPlaceholder_-1854013440"/>
           </w:placeholder>
         </w:sdtPr>
-        <w:sdtEndPr/>
         <w:sdtContent>
           <w:r>
             <w:rPr>
@@ -11134,13 +11124,150 @@
     </w:p>
     <w:p>
       <w:pPr>
-        <w:rPr>
-          <w:rFonts w:ascii="Times New Roman" w:eastAsia="Times New Roman" w:hAnsi="Times New Roman" w:cs="Times New Roman"/>
-        </w:rPr>
+        <w:spacing w:after="120" w:line="480" w:lineRule="auto"/>
       </w:pPr>
     </w:p>
     <w:p>
       <w:pPr>
+        <w:spacing w:after="120" w:line="480" w:lineRule="auto"/>
+      </w:pPr>
+    </w:p>
+    <w:p>
+      <w:pPr>
+        <w:spacing w:after="120" w:line="480" w:lineRule="auto"/>
+        <w:rPr>
+          <w:rFonts w:ascii="Times New Roman" w:hAnsi="Times New Roman" w:cs="Times New Roman"/>
+        </w:rPr>
+      </w:pPr>
+      <w:r>
+        <w:rPr>
+          <w:rFonts w:ascii="Times New Roman" w:hAnsi="Times New Roman" w:cs="Times New Roman"/>
+        </w:rPr>
+        <w:lastRenderedPageBreak/>
+        <w:t>3.4.</w:t>
+      </w:r>
+      <w:r>
+        <w:rPr>
+          <w:rFonts w:ascii="Times New Roman" w:hAnsi="Times New Roman" w:cs="Times New Roman"/>
+        </w:rPr>
+        <w:t xml:space="preserve">1 </w:t>
+      </w:r>
+      <w:r>
+        <w:rPr>
+          <w:rFonts w:ascii="Times New Roman" w:hAnsi="Times New Roman" w:cs="Times New Roman"/>
+        </w:rPr>
+        <w:t>Missing</w:t>
+      </w:r>
+      <w:r>
+        <w:rPr>
+          <w:rFonts w:ascii="Times New Roman" w:hAnsi="Times New Roman" w:cs="Times New Roman"/>
+        </w:rPr>
+        <w:t xml:space="preserve"> Variable Analysis</w:t>
+      </w:r>
+    </w:p>
+    <w:p>
+      <w:pPr>
+        <w:spacing w:after="120" w:line="480" w:lineRule="auto"/>
+        <w:rPr>
+          <w:rFonts w:ascii="Times New Roman" w:hAnsi="Times New Roman" w:cs="Times New Roman"/>
+        </w:rPr>
+      </w:pPr>
+      <w:r>
+        <w:rPr>
+          <w:rFonts w:ascii="Times New Roman" w:hAnsi="Times New Roman" w:cs="Times New Roman"/>
+        </w:rPr>
+        <w:t xml:space="preserve">Missing data are common in administrative datasets such as the CRVS system, as the completeness of information depends on the reporting process and data availability at the time of </w:t>
+      </w:r>
+      <w:r>
+        <w:rPr>
+          <w:rFonts w:ascii="Times New Roman" w:hAnsi="Times New Roman" w:cs="Times New Roman"/>
+        </w:rPr>
+        <w:t>registration.</w:t>
+      </w:r>
+      <w:r>
+        <w:rPr>
+          <w:rFonts w:ascii="Times New Roman" w:hAnsi="Times New Roman" w:cs="Times New Roman"/>
+        </w:rPr>
+        <w:t xml:space="preserve"> </w:t>
+      </w:r>
+      <w:proofErr w:type="gramStart"/>
+      <w:r>
+        <w:rPr>
+          <w:rFonts w:ascii="Times New Roman" w:hAnsi="Times New Roman" w:cs="Times New Roman"/>
+        </w:rPr>
+        <w:t>Therefore ,</w:t>
+      </w:r>
+      <w:proofErr w:type="gramEnd"/>
+      <w:r>
+        <w:rPr>
+          <w:rFonts w:ascii="Times New Roman" w:hAnsi="Times New Roman" w:cs="Times New Roman"/>
+        </w:rPr>
+        <w:t xml:space="preserve"> analysis of missing data was conducted as a prior </w:t>
+      </w:r>
+      <w:proofErr w:type="gramStart"/>
+      <w:r>
+        <w:rPr>
+          <w:rFonts w:ascii="Times New Roman" w:hAnsi="Times New Roman" w:cs="Times New Roman"/>
+        </w:rPr>
+        <w:t>step .</w:t>
+      </w:r>
+      <w:proofErr w:type="gramEnd"/>
+      <w:r>
+        <w:rPr>
+          <w:rFonts w:ascii="Times New Roman" w:hAnsi="Times New Roman" w:cs="Times New Roman"/>
+        </w:rPr>
+        <w:t xml:space="preserve"> </w:t>
+      </w:r>
+    </w:p>
+    <w:p>
+      <w:pPr>
+        <w:spacing w:after="120" w:line="480" w:lineRule="auto"/>
+        <w:rPr>
+          <w:rFonts w:ascii="Times New Roman" w:hAnsi="Times New Roman" w:cs="Times New Roman"/>
+        </w:rPr>
+      </w:pPr>
+    </w:p>
+    <w:p>
+      <w:pPr>
+        <w:rPr>
+          <w:rFonts w:ascii="Times New Roman" w:eastAsia="Times New Roman" w:hAnsi="Times New Roman" w:cs="Times New Roman"/>
+        </w:rPr>
+      </w:pPr>
+    </w:p>
+    <w:p>
+      <w:pPr>
+        <w:rPr>
+          <w:rFonts w:ascii="Times New Roman" w:eastAsia="Times New Roman" w:hAnsi="Times New Roman" w:cs="Times New Roman"/>
+        </w:rPr>
+      </w:pPr>
+    </w:p>
+    <w:p>
+      <w:pPr>
+        <w:rPr>
+          <w:rFonts w:ascii="Times New Roman" w:eastAsia="Times New Roman" w:hAnsi="Times New Roman" w:cs="Times New Roman"/>
+        </w:rPr>
+      </w:pPr>
+    </w:p>
+    <w:p>
+      <w:pPr>
+        <w:rPr>
+          <w:rFonts w:ascii="Times New Roman" w:eastAsia="Times New Roman" w:hAnsi="Times New Roman" w:cs="Times New Roman"/>
+        </w:rPr>
+      </w:pPr>
+    </w:p>
+    <w:p>
+      <w:pPr>
+        <w:rPr>
+          <w:rFonts w:ascii="Times New Roman" w:eastAsia="Times New Roman" w:hAnsi="Times New Roman" w:cs="Times New Roman"/>
+        </w:rPr>
+      </w:pPr>
+    </w:p>
+    <w:p>
+      <w:pPr>
+        <w:autoSpaceDE w:val="0"/>
+        <w:autoSpaceDN w:val="0"/>
+        <w:ind w:left="480" w:hanging="480"/>
+        <w:divId w:val="601449426"/>
         <w:rPr>
           <w:rFonts w:ascii="Times New Roman" w:eastAsia="Times New Roman" w:hAnsi="Times New Roman" w:cs="Times New Roman"/>
         </w:rPr>
@@ -12648,7 +12775,7 @@
   <w:rsids>
     <w:rsidRoot w:val="00FF3CC2"/>
     <w:rsid w:val="000B01B3"/>
-    <w:rsid w:val="000B1E84"/>
+    <w:rsid w:val="002C173E"/>
     <w:rsid w:val="003E3805"/>
     <w:rsid w:val="004668E6"/>
     <w:rsid w:val="0058343D"/>

</xml_diff>